<commit_message>
Update datasheet and fix issue with newline char ingestion after UAT uplink ingest
</commit_message>
<xml_diff>
--- a/word/datasheet_adsbee_1090.docx
+++ b/word/datasheet_adsbee_1090.docx
@@ -20,7 +20,7 @@
           <w:noProof/>
         </w:rPr>
         <w:drawing>
-          <wp:anchor distT="0" distB="0" distL="114300" distR="114300" simplePos="0" relativeHeight="251659264" behindDoc="0" locked="0" layoutInCell="1" allowOverlap="1" wp14:anchorId="7F955F12" wp14:editId="211CDA57">
+          <wp:anchor distT="0" distB="0" distL="114300" distR="114300" simplePos="0" relativeHeight="251659264" behindDoc="0" locked="0" layoutInCell="1" allowOverlap="1" wp14:anchorId="7F955F12" wp14:editId="4B499194">
             <wp:simplePos x="0" y="0"/>
             <wp:positionH relativeFrom="margin">
               <wp:posOffset>3493770</wp:posOffset>
@@ -79,7 +79,7 @@
         <w:rPr>
           <w:noProof/>
         </w:rPr>
-        <w:pict w14:anchorId="2BBA3B7B">
+        <w:pict w14:anchorId="13580013">
           <v:shapetype id="_x0000_t202" coordsize="21600,21600" o:spt="202" path="m,l,21600r21600,l21600,xe">
             <v:stroke joinstyle="miter"/>
             <v:path gradientshapeok="t" o:connecttype="rect"/>
@@ -197,7 +197,25 @@
         <w:rPr>
           <w:noProof/>
         </w:rPr>
-        <w:pict w14:anchorId="1D6918FF">
+        <w:fldChar w:fldCharType="begin"/>
+      </w:r>
+      <w:r>
+        <w:rPr>
+          <w:noProof/>
+        </w:rPr>
+        <w:instrText xml:space="preserve"> INCLUDEPICTURE  "https://pantsforbirds.com/wp-content/uploads/2025/06/image.png" \* MERGEFORMATINET </w:instrText>
+      </w:r>
+      <w:r>
+        <w:rPr>
+          <w:noProof/>
+        </w:rPr>
+        <w:fldChar w:fldCharType="separate"/>
+      </w:r>
+      <w:r>
+        <w:rPr>
+          <w:noProof/>
+        </w:rPr>
+        <w:pict w14:anchorId="01985169">
           <v:shapetype id="_x0000_t75" coordsize="21600,21600" o:spt="75" o:preferrelative="t" path="m@4@5l@4@11@9@11@9@5xe" filled="f" stroked="f">
             <v:stroke joinstyle="miter"/>
             <v:formulas>
@@ -221,6 +239,12 @@
             <v:imagedata r:id="rId12" r:href="rId13"/>
           </v:shape>
         </w:pict>
+      </w:r>
+      <w:r>
+        <w:rPr>
+          <w:noProof/>
+        </w:rPr>
+        <w:fldChar w:fldCharType="end"/>
       </w:r>
       <w:r>
         <w:rPr>
@@ -10381,6 +10405,139 @@
       </w:pPr>
       <w:bookmarkStart w:id="18" w:name="_Toc209911266"/>
       <w:r>
+        <w:t>AT+BOOT_USB_UF2</w:t>
+      </w:r>
+    </w:p>
+    <w:p>
+      <w:r>
+        <w:t>Reboots the ADSBee into UF2 Bootloader mode. ONLY use this command if you have USB access to your ADSBee! There is no way to recover from the factory UF2 bootloader other than resetting the device or flashing a firmware file to it over USB.</w:t>
+      </w:r>
+    </w:p>
+    <w:p>
+      <w:pPr>
+        <w:pStyle w:val="code"/>
+      </w:pPr>
+      <w:r>
+        <w:t>AT+BOOT_USB_UF2=&lt;reboot_passcode&gt;</w:t>
+      </w:r>
+    </w:p>
+    <w:p/>
+    <w:tbl>
+      <w:tblPr>
+        <w:tblStyle w:val="TableGrid"/>
+        <w:tblW w:w="0" w:type="auto"/>
+        <w:tblLook w:val="04A0" w:firstRow="1" w:lastRow="0" w:firstColumn="1" w:lastColumn="0" w:noHBand="0" w:noVBand="1"/>
+      </w:tblPr>
+      <w:tblGrid>
+        <w:gridCol w:w="1792"/>
+        <w:gridCol w:w="5637"/>
+        <w:gridCol w:w="3587"/>
+      </w:tblGrid>
+      <w:tr>
+        <w:tc>
+          <w:tcPr>
+            <w:tcW w:w="1792" w:type="dxa"/>
+          </w:tcPr>
+          <w:p>
+            <w:pPr>
+              <w:rPr>
+                <w:b/>
+                <w:bCs/>
+              </w:rPr>
+            </w:pPr>
+            <w:r>
+              <w:rPr>
+                <w:b/>
+                <w:bCs/>
+              </w:rPr>
+              <w:t>Parameter</w:t>
+            </w:r>
+          </w:p>
+        </w:tc>
+        <w:tc>
+          <w:tcPr>
+            <w:tcW w:w="5637" w:type="dxa"/>
+          </w:tcPr>
+          <w:p>
+            <w:pPr>
+              <w:rPr>
+                <w:b/>
+                <w:bCs/>
+              </w:rPr>
+            </w:pPr>
+            <w:r>
+              <w:rPr>
+                <w:b/>
+                <w:bCs/>
+              </w:rPr>
+              <w:t>Description</w:t>
+            </w:r>
+          </w:p>
+        </w:tc>
+        <w:tc>
+          <w:tcPr>
+            <w:tcW w:w="3587" w:type="dxa"/>
+          </w:tcPr>
+          <w:p>
+            <w:pPr>
+              <w:rPr>
+                <w:b/>
+                <w:bCs/>
+              </w:rPr>
+            </w:pPr>
+            <w:r>
+              <w:rPr>
+                <w:b/>
+                <w:bCs/>
+              </w:rPr>
+              <w:t>Acceptable Values</w:t>
+            </w:r>
+          </w:p>
+        </w:tc>
+      </w:tr>
+      <w:tr>
+        <w:tc>
+          <w:tcPr>
+            <w:tcW w:w="1792" w:type="dxa"/>
+          </w:tcPr>
+          <w:p>
+            <w:r>
+              <w:t>reboot_passcode</w:t>
+            </w:r>
+          </w:p>
+        </w:tc>
+        <w:tc>
+          <w:tcPr>
+            <w:tcW w:w="5637" w:type="dxa"/>
+          </w:tcPr>
+          <w:p>
+            <w:r>
+              <w:t>A passcode that makes it harder to run this command by accident.</w:t>
+            </w:r>
+          </w:p>
+        </w:tc>
+        <w:tc>
+          <w:tcPr>
+            <w:tcW w:w="3587" w:type="dxa"/>
+          </w:tcPr>
+          <w:p>
+            <w:r>
+              <w:t>“1DEADBEE”</w:t>
+            </w:r>
+          </w:p>
+        </w:tc>
+      </w:tr>
+    </w:tbl>
+    <w:p/>
+    <w:p>
+      <w:pPr>
+        <w:pStyle w:val="Heading2"/>
+        <w:numPr>
+          <w:ilvl w:val="1"/>
+          <w:numId w:val="10"/>
+        </w:numPr>
+      </w:pPr>
+      <w:r>
         <w:t>AT+DEVICE_INFO</w:t>
       </w:r>
       <w:bookmarkEnd w:id="18"/>
@@ -10466,7 +10623,14 @@
               <w:rPr>
                 <w:rFonts w:ascii="Courier New" w:hAnsi="Courier New" w:cs="Courier New"/>
               </w:rPr>
-              <w:t>OTA Key 1: 1701a736dc40c837f318c9e7ae82557a39fe07588d3745602bb9269b13843b87ca7962daecc9897c6dfb0ac4ec77997e9cc34cd356e415fc46eb4ae3dd42b717</w:t>
+              <w:t>OTA Key 1: 1701a736dc40c837f318c9e7ae82557a39fe07588d3745602bb9269b13843b87ca7962daecc9897c6</w:t>
+            </w:r>
+            <w:r>
+              <w:rPr>
+                <w:rFonts w:ascii="Courier New" w:hAnsi="Courier New" w:cs="Courier New"/>
+              </w:rPr>
+              <w:lastRenderedPageBreak/>
+              <w:t>dfb0ac4ec77997e9cc34cd356e415fc46eb4ae3dd42b717</w:t>
             </w:r>
           </w:p>
           <w:p>
@@ -34252,7 +34416,7 @@
         <w:noProof/>
         <w:color w:val="FFFFFF" w:themeColor="background1"/>
       </w:rPr>
-      <w:pict w14:anchorId="2835FEAC">
+      <w:pict w14:anchorId="6ACC85AF">
         <v:rect id="_x0000_s1025" alt="" style="position:absolute;left:0;text-align:left;margin-left:-82.1pt;margin-top:.05pt;width:664.9pt;height:84.5pt;z-index:-251657728;mso-wrap-edited:f;mso-width-percent:0;mso-height-percent:0;mso-width-percent:0;mso-height-percent:0" fillcolor="#00ad4d" stroked="f"/>
       </w:pict>
     </w:r>
@@ -34419,13 +34583,13 @@
       <w:rPr>
         <w:color w:val="FFFFFF" w:themeColor="background1"/>
       </w:rPr>
-      <w:t>20250</w:t>
+      <w:t>202</w:t>
     </w:r>
     <w:r>
       <w:rPr>
         <w:color w:val="FFFFFF" w:themeColor="background1"/>
       </w:rPr>
-      <w:t>901</w:t>
+      <w:t>60419</w:t>
     </w:r>
     <w:r>
       <w:rPr>
@@ -38643,6 +38807,92 @@
     <w:tmpl w:val="624C7896"/>
     <w:numStyleLink w:val="Style1"/>
   </w:abstractNum>
+  <w:abstractNum w:abstractNumId="51" w15:restartNumberingAfterBreak="0">
+    <w:nsid w:val="7DAD2DCC"/>
+    <w:multiLevelType w:val="hybridMultilevel"/>
+    <w:tmpl w:val="9B64BE0A"/>
+    <w:lvl w:ilvl="0" w:tplc="0409000F">
+      <w:start w:val="1"/>
+      <w:numFmt w:val="decimal"/>
+      <w:lvlText w:val="%1."/>
+      <w:lvlJc w:val="left"/>
+      <w:pPr>
+        <w:ind w:left="360" w:hanging="360"/>
+      </w:pPr>
+    </w:lvl>
+    <w:lvl w:ilvl="1" w:tplc="04090019" w:tentative="1">
+      <w:start w:val="1"/>
+      <w:numFmt w:val="lowerLetter"/>
+      <w:lvlText w:val="%2."/>
+      <w:lvlJc w:val="left"/>
+      <w:pPr>
+        <w:ind w:left="1080" w:hanging="360"/>
+      </w:pPr>
+    </w:lvl>
+    <w:lvl w:ilvl="2" w:tplc="0409001B" w:tentative="1">
+      <w:start w:val="1"/>
+      <w:numFmt w:val="lowerRoman"/>
+      <w:lvlText w:val="%3."/>
+      <w:lvlJc w:val="right"/>
+      <w:pPr>
+        <w:ind w:left="1800" w:hanging="180"/>
+      </w:pPr>
+    </w:lvl>
+    <w:lvl w:ilvl="3" w:tplc="0409000F" w:tentative="1">
+      <w:start w:val="1"/>
+      <w:numFmt w:val="decimal"/>
+      <w:lvlText w:val="%4."/>
+      <w:lvlJc w:val="left"/>
+      <w:pPr>
+        <w:ind w:left="2520" w:hanging="360"/>
+      </w:pPr>
+    </w:lvl>
+    <w:lvl w:ilvl="4" w:tplc="04090019" w:tentative="1">
+      <w:start w:val="1"/>
+      <w:numFmt w:val="lowerLetter"/>
+      <w:lvlText w:val="%5."/>
+      <w:lvlJc w:val="left"/>
+      <w:pPr>
+        <w:ind w:left="3240" w:hanging="360"/>
+      </w:pPr>
+    </w:lvl>
+    <w:lvl w:ilvl="5" w:tplc="0409001B" w:tentative="1">
+      <w:start w:val="1"/>
+      <w:numFmt w:val="lowerRoman"/>
+      <w:lvlText w:val="%6."/>
+      <w:lvlJc w:val="right"/>
+      <w:pPr>
+        <w:ind w:left="3960" w:hanging="180"/>
+      </w:pPr>
+    </w:lvl>
+    <w:lvl w:ilvl="6" w:tplc="0409000F" w:tentative="1">
+      <w:start w:val="1"/>
+      <w:numFmt w:val="decimal"/>
+      <w:lvlText w:val="%7."/>
+      <w:lvlJc w:val="left"/>
+      <w:pPr>
+        <w:ind w:left="4680" w:hanging="360"/>
+      </w:pPr>
+    </w:lvl>
+    <w:lvl w:ilvl="7" w:tplc="04090019" w:tentative="1">
+      <w:start w:val="1"/>
+      <w:numFmt w:val="lowerLetter"/>
+      <w:lvlText w:val="%8."/>
+      <w:lvlJc w:val="left"/>
+      <w:pPr>
+        <w:ind w:left="5400" w:hanging="360"/>
+      </w:pPr>
+    </w:lvl>
+    <w:lvl w:ilvl="8" w:tplc="0409001B" w:tentative="1">
+      <w:start w:val="1"/>
+      <w:numFmt w:val="lowerRoman"/>
+      <w:lvlText w:val="%9."/>
+      <w:lvlJc w:val="right"/>
+      <w:pPr>
+        <w:ind w:left="6120" w:hanging="180"/>
+      </w:pPr>
+    </w:lvl>
+  </w:abstractNum>
   <w:num w:numId="1" w16cid:durableId="638340843">
     <w:abstractNumId w:val="4"/>
   </w:num>
@@ -38813,6 +39063,9 @@
   </w:num>
   <w:num w:numId="51" w16cid:durableId="949777092">
     <w:abstractNumId w:val="8"/>
+  </w:num>
+  <w:num w:numId="52" w16cid:durableId="1517159773">
+    <w:abstractNumId w:val="51"/>
   </w:num>
 </w:numbering>
 </file>

</xml_diff>

<commit_message>
Fix AGENTS file and fix latent issues with CC1312 SPI interface (#191)
* Fix AGENTS file and fix latent issues with CC1312 SPI interface

* Update datasheet

* Fix packet length reading on SPI bus
</commit_message>
<xml_diff>
--- a/word/datasheet_adsbee_1090.docx
+++ b/word/datasheet_adsbee_1090.docx
@@ -79,7 +79,7 @@
         <w:rPr>
           <w:noProof/>
         </w:rPr>
-        <w:pict w14:anchorId="19FA373A">
+        <w:pict w14:anchorId="5DB8408C">
           <v:shapetype id="_x0000_t202" coordsize="21600,21600" o:spt="202" path="m,l,21600r21600,l21600,xe">
             <v:stroke joinstyle="miter"/>
             <v:path gradientshapeok="t" o:connecttype="rect"/>
@@ -179,7 +179,7 @@
         <w:rPr>
           <w:noProof/>
         </w:rPr>
-        <w:pict w14:anchorId="400AF184">
+        <w:pict w14:anchorId="405D4286">
           <v:shapetype id="_x0000_t75" coordsize="21600,21600" o:spt="75" o:preferrelative="t" path="m@4@5l@4@11@9@11@9@5xe" filled="f" stroked="f">
             <v:stroke joinstyle="miter"/>
             <v:formulas>
@@ -40225,7 +40225,7 @@
         <w:noProof/>
         <w:color w:val="FFFFFF" w:themeColor="background1"/>
       </w:rPr>
-      <w:pict w14:anchorId="246B1624">
+      <w:pict w14:anchorId="4569B039">
         <v:rect id="_x0000_s1025" alt="" style="position:absolute;left:0;text-align:left;margin-left:-82.1pt;margin-top:.05pt;width:664.9pt;height:84.5pt;z-index:-251657728;mso-wrap-edited:f;mso-width-percent:0;mso-height-percent:0;mso-width-percent:0;mso-height-percent:0" fillcolor="#00ad4d" stroked="f"/>
       </w:pict>
     </w:r>

</xml_diff>